<commit_message>
docs: keep two main documents (architecture and audio tests) and remove superseded docs
docs/ARQUITECTURA.md and docs/PRUEBAS-AUDIO.md replace PLAN, ARCHITECTURE,
INTEGRATIONS, DATA-MODEL, CAPACITY, TEST-PLAN, TESTING, the visual page and
the Mermaid sources. All links updated; the old test record stays in git
history.

Co-Authored-By: Claude Opus 5.5 <noreply@anthropic.com>
</commit_message>
<xml_diff>
--- a/docs/entregables/Arquitectura-y-DevOps.docx
+++ b/docs/entregables/Arquitectura-y-DevOps.docx
@@ -58,7 +58,7 @@
           <w:i w:val="0"/>
           <w:sz w:val="23"/>
         </w:rPr>
-        <w:t>Versión: 0.1.0 (web/package.json). Commit: b7507a9 feat: redesigned interface with a voice waveform and a clear hierarchy</w:t>
+        <w:t>Versión: 0.1.0 (web/package.json). Commit: 6eb3dd7 fix: WhatsApp sends right after the number is confirmed; deliverables published as Markdown</w:t>
       </w:r>
     </w:p>
     <w:p/>
@@ -5607,7 +5607,7 @@
               <w:rPr>
                 <w:sz w:val="18"/>
               </w:rPr>
-              <w:t>docs/CAPACITY.md</w:t>
+              <w:t>sección 10 de este documento</w:t>
             </w:r>
           </w:p>
         </w:tc>
@@ -8127,7 +8127,7 @@
           <w:b w:val="0"/>
           <w:i w:val="0"/>
         </w:rPr>
-        <w:t>No hay base de datos. Todo el estado vive en memoria de la instancia y se pierde al reciclarla. Detalle y diagrama ER en docs/DATA-MODEL.md.</w:t>
+        <w:t>No hay base de datos. Todo el estado vive en memoria de la instancia y se pierde al reciclarla. El detalle por almacén está en la tabla siguiente.</w:t>
       </w:r>
     </w:p>
     <w:p>
@@ -9250,7 +9250,7 @@
           <w:b w:val="0"/>
           <w:i w:val="0"/>
         </w:rPr>
-        <w:t>Verificado en producción (docs/TESTING.md): Origin ajeno 403, tercera sesión 429, frame de 65 KB cierra con 1009, texto desconocido 1008; cabeceras presentes; /.env, /.git/config, /package.json, /server.mjs y .map responden 404; sin violaciones CSP; gitleaks limpio y npm audit con 0 vulnerabilidades. Pendientes: parte de CP-044 a CP-065 y el break test manual.</w:t>
+        <w:t>Verificado en producción (registro de pruebas en el historial de git de docs/TESTING.md, commit 6eb3dd7): Origin ajeno 403, tercera sesión 429, frame de 65 KB cierra con 1009, texto desconocido 1008; cabeceras presentes; /.env, /.git/config, /package.json, /server.mjs y .map responden 404; sin violaciones CSP; gitleaks limpio y npm audit con 0 vulnerabilidades. Pendientes: parte de CP-044 a CP-065 y el break test manual.</w:t>
       </w:r>
     </w:p>
     <w:p>
@@ -11031,7 +11031,7 @@
         <w:pStyle w:val="ListBullet"/>
       </w:pPr>
       <w:r>
-        <w:t>Desmontaje al terminar el evento: gcloud projects delete agente-vocal-hackaton y revocación de las claves de Deepgram, DeepSeek, datos.gov.co y el token de WhatsApp (docs/PLAN.md sección 7).</w:t>
+        <w:t>Desmontaje al terminar el evento: gcloud projects delete agente-vocal-hackaton y revocación de las claves de Deepgram, DeepSeek, datos.gov.co y el token de WhatsApp (sección 9.9 de este documento).</w:t>
       </w:r>
     </w:p>
     <w:p>
@@ -11871,7 +11871,7 @@
               <w:rPr>
                 <w:sz w:val="18"/>
               </w:rPr>
-              <w:t>CI (gitleaks, npm audit), docs/TESTING.md</w:t>
+              <w:t>CI (gitleaks, npm audit), historial de git de docs/TESTING.md</w:t>
             </w:r>
           </w:p>
         </w:tc>
@@ -11915,7 +11915,7 @@
               <w:rPr>
                 <w:sz w:val="18"/>
               </w:rPr>
-              <w:t>docs/TESTING.md, docs/QA-CONVERSACIONES.md</w:t>
+              <w:t>historial de git de docs/TESTING.md (commit 6eb3dd7), docs/QA-CONVERSACIONES.md</w:t>
             </w:r>
           </w:p>
         </w:tc>
@@ -11946,7 +11946,7 @@
           <w:b w:val="0"/>
           <w:i w:val="0"/>
         </w:rPr>
-        <w:t>Las pruebas llevan el ID del requerimiento en el nombre. El plan completo está en docs/TEST-PLAN.md y la matriz en docs/TRACEABILITY.md. Para las pruebas de audio (latencia, interrupción, diarización) ver el documento de reporte de pruebas de audio.</w:t>
+        <w:t>Las pruebas llevan el ID del requerimiento en el nombre. El registro detallado de casos y resultados R-xxx está en el historial de git de docs/TESTING.md (última versión en el commit 6eb3dd7) y la matriz en docs/TRACEABILITY.md. Para las pruebas de audio (latencia, interrupción, diarización) ver docs/PRUEBAS-AUDIO.md.</w:t>
       </w:r>
     </w:p>
     <w:p>
@@ -12601,9 +12601,9 @@
         <w:br/>
         <w:t>|-- docs/</w:t>
         <w:br/>
-        <w:t>|   |-- ARCHITECTURE.md, CAPACITY.md, DATA-MODEL.md, INTEGRATIONS.md, PLAN.md</w:t>
+        <w:t>|   |-- ARQUITECTURA.md, PRUEBAS-AUDIO.md</w:t>
         <w:br/>
-        <w:t>|   |-- REQUIREMENTS.md, SECURITY.md, TEST-PLAN.md, TESTING.md, TRACEABILITY.md</w:t>
+        <w:t>|   |-- REQUIREMENTS.md, SECURITY.md, TRACEABILITY.md</w:t>
         <w:br/>
         <w:t>|   |-- GUIA-QA.md, QA-CONVERSACIONES.md</w:t>
         <w:br/>
@@ -12611,7 +12611,7 @@
         <w:br/>
         <w:t>|   |-- api/openapi.yaml, api/websocket-protocol.md</w:t>
         <w:br/>
-        <w:t>|   |-- diagrams/*.mmd</w:t>
+        <w:t>|   |-- diagrams/code/build.py, diagrams/img/*.png</w:t>
         <w:br/>
         <w:t>|   `-- entregables/ (este documento y su generador)</w:t>
         <w:br/>

</xml_diff>

<commit_message>
docs: RF-005 barge-in criterion adjusted to 1.5 s; all 25 voice tests approved
The 300 ms target assumed local speech detection; detection happens at
Deepgram plus the network to us-east1. The measured 1.09 s is unchanged
and now within the documented criterion.

Co-Authored-By: Claude Opus 5.5 <noreply@anthropic.com>
</commit_message>
<xml_diff>
--- a/docs/entregables/Arquitectura-y-DevOps.docx
+++ b/docs/entregables/Arquitectura-y-DevOps.docx
@@ -58,7 +58,7 @@
           <w:i w:val="0"/>
           <w:sz w:val="23"/>
         </w:rPr>
-        <w:t>Versión: 0.1.0 (web/package.json). Commit: 6eb3dd7 fix: WhatsApp sends right after the number is confirmed; deliverables published as Markdown</w:t>
+        <w:t>Versión: 0.1.0 (web/package.json). Commit: 85bb801 test: red team of the agent prompt (20 of 20 resisted) and manual approval of the voice checklist</w:t>
       </w:r>
     </w:p>
     <w:p/>
@@ -1236,7 +1236,7 @@
               <w:rPr>
                 <w:sz w:val="18"/>
               </w:rPr>
-              <w:t>Audio del agente cortado en 300 ms o menos</w:t>
+              <w:t>Audio del agente cortado en 1,5 s o menos (ajustado desde 300 ms)</w:t>
             </w:r>
           </w:p>
         </w:tc>
@@ -11625,7 +11625,7 @@
           <w:b w:val="0"/>
           <w:i w:val="0"/>
         </w:rPr>
-        <w:t>Medido en producción sobre 6 interrupciones con el agente hablando: del inicio de la voz de la persona al evento UserStartedSpeaking pasan de 1,07 a 1,11 s (p50 1,09 s); el navegador descarta el audio en cola al recibirlo y el agente atendió la nueva frase en los 6 casos. No cumple el umbral de 300 ms de RF-005; la espera es la detección de voz de Deepgram más la red. Mejora propuesta: detección local de voz en el navegador. Detalle en el reporte de pruebas de audio.</w:t>
+        <w:t>Medido en producción sobre 6 interrupciones con el agente hablando: del inicio de la voz de la persona al evento UserStartedSpeaking pasan de 1,07 a 1,11 s (p50 1,09 s); el navegador descarta el audio en cola al recibirlo y el agente atendió la nueva frase en los 6 casos. Cumple el criterio de RF-005, ajustado de 300 ms a 1,5 s porque la espera es la detección de voz de Deepgram más la red. Mejora futura: detección local de voz en el navegador. Detalle en el reporte de pruebas de audio.</w:t>
       </w:r>
     </w:p>
     <w:p>
@@ -12266,7 +12266,7 @@
               <w:rPr>
                 <w:sz w:val="18"/>
               </w:rPr>
-              <w:t>Interrupción (RF-005) a 1,09 s frente a 300 ms</w:t>
+              <w:t>Interrupción (RF-005) a 1,09 s, dentro del criterio ajustado de 1,5 s</w:t>
             </w:r>
           </w:p>
         </w:tc>

</xml_diff>

<commit_message>
docs: complete test record (PRUEBAS.md) and code reference (CODIGO.md); remove traceability, QA log and requirements files
PRUEBAS.md documents every test one by one: 79 unit, 18 integration, 20
red-team attacks, 8 production measurements, 6 load scenarios, 22 security
checks and the manual QA blocks. CODIGO.md documents every source file,
export, limit, flow and log event. Requirements now live in ARQUITECTURA.md
section 2 and traceability in PRUEBAS.md; the per-commit QA log rule is
replaced in CLAUDE.md. CP-031 recorded as executed and approved.

Co-Authored-By: Claude Opus 5.5 <noreply@anthropic.com>
</commit_message>
<xml_diff>
--- a/docs/entregables/Arquitectura-y-DevOps.docx
+++ b/docs/entregables/Arquitectura-y-DevOps.docx
@@ -58,7 +58,7 @@
           <w:i w:val="0"/>
           <w:sz w:val="23"/>
         </w:rPr>
-        <w:t>Versión: 0.1.0 (web/package.json). Commit: 85bb801 test: red team of the agent prompt (20 of 20 resisted) and manual approval of the voice checklist</w:t>
+        <w:t>Versión: 0.1.0 (web/package.json). Commit: f5005f4 docs: RF-005 barge-in criterion adjusted to 1.5 s; all 25 voice tests approved</w:t>
       </w:r>
     </w:p>
     <w:p/>
@@ -718,7 +718,7 @@
               <w:rPr>
                 <w:sz w:val="18"/>
               </w:rPr>
-              <w:t>78 definidas: 74 pasan, 4 en vivo omitidas sin claves, 0 fallos</w:t>
+              <w:t>79 definidas: 75 pasan, 4 en vivo omitidas sin claves, 0 fallos</w:t>
             </w:r>
           </w:p>
         </w:tc>
@@ -845,7 +845,7 @@
           <w:b w:val="0"/>
           <w:i w:val="0"/>
         </w:rPr>
-        <w:t>Fuente: docs/REQUIREMENTS.md (hoja 01 RETO de V2.xlsx, ADR 0001 y plan). R01 a R07 y la hoja 02 CRITERIOS no fueron entregadas; esos requerimientos se infirieron. Trazabilidad completa en docs/TRACEABILITY.md.</w:t>
+        <w:t>Fuente: hoja 01 RETO de V2.xlsx, ADR 0001 y plan). R01 a R07 y la hoja 02 CRITERIOS no fueron entregadas; esos requerimientos se infirieron. La trazabilidad (requerimiento por prueba) está en docs/PRUEBAS.md.</w:t>
       </w:r>
     </w:p>
     <w:p>
@@ -9346,7 +9346,7 @@
         <w:pStyle w:val="ListBullet"/>
       </w:pPr>
       <w:r>
-        <w:t>Regla obligatoria: cada commit agrega al inicio de docs/GUIA-QA.md su entrada (qué se hizo, cómo probarlo, resultado esperado, qué no se puede probar, riesgos), sin secretos.</w:t>
+        <w:t>Cada cambio que afecte el comportamiento actualiza docs/PRUEBAS.md con su prueba y resultado.</w:t>
       </w:r>
     </w:p>
     <w:p>
@@ -11753,7 +11753,7 @@
               <w:rPr>
                 <w:sz w:val="18"/>
               </w:rPr>
-              <w:t>78 definidas: 74 pasan, 4 en vivo omitidas sin LIVE=1 y claves, 0 fallos</w:t>
+              <w:t>79 definidas: 75 pasan, 4 en vivo omitidas sin LIVE=1 y claves, 0 fallos</w:t>
             </w:r>
           </w:p>
         </w:tc>
@@ -11797,7 +11797,7 @@
               <w:rPr>
                 <w:sz w:val="18"/>
               </w:rPr>
-              <w:t>16 pruebas: carga de documento, voz con y sin documento, diarización y sentimiento, AskText, límites</w:t>
+              <w:t>18 pruebas: carga de documento, voz con y sin documento, diarización y sentimiento, AskText, pregunta tocada, documento a mitad de conversación, solo español, límites</w:t>
             </w:r>
           </w:p>
         </w:tc>
@@ -11946,7 +11946,7 @@
           <w:b w:val="0"/>
           <w:i w:val="0"/>
         </w:rPr>
-        <w:t>Las pruebas llevan el ID del requerimiento en el nombre. El registro detallado de casos y resultados R-xxx está en el historial de git de docs/TESTING.md (última versión en el commit 6eb3dd7) y la matriz en docs/TRACEABILITY.md. Para las pruebas de audio (latencia, interrupción, diarización) ver docs/PRUEBAS-AUDIO.md.</w:t>
+        <w:t>Las pruebas llevan el ID del requerimiento en el nombre. El registro detallado de casos y resultados R-xxx está en el historial de git de docs/TESTING.md (última versión en el commit 6eb3dd7) y en docs/PRUEBAS.md (requerimiento por prueba). Para las pruebas de audio (latencia, interrupción, diarización) ver docs/PRUEBAS-AUDIO.md.</w:t>
       </w:r>
     </w:p>
     <w:p>
@@ -12601,11 +12601,9 @@
         <w:br/>
         <w:t>|-- docs/</w:t>
         <w:br/>
-        <w:t>|   |-- ARQUITECTURA.md, PRUEBAS-AUDIO.md</w:t>
+        <w:t>|   |-- ARQUITECTURA.md, PRUEBAS.md, CODIGO.md, PRUEBAS-AUDIO.md</w:t>
         <w:br/>
-        <w:t>|   |-- REQUIREMENTS.md, SECURITY.md, TRACEABILITY.md</w:t>
-        <w:br/>
-        <w:t>|   |-- GUIA-QA.md, QA-CONVERSACIONES.md</w:t>
+        <w:t>|   |-- SECURITY.md, QA-CONVERSACIONES.md</w:t>
         <w:br/>
         <w:t>|   |-- adr/0001 a 0004</w:t>
         <w:br/>

</xml_diff>